<commit_message>
25 Oct 11:07 update
</commit_message>
<xml_diff>
--- a/RMX_Report/LAB1_2_Incremental_Encoder.docx
+++ b/RMX_Report/LAB1_2_Incremental_Encoder.docx
@@ -432,55 +432,36 @@
         </w:numPr>
         <w:spacing w:after="0" w:line="240" w:lineRule="auto"/>
         <w:jc w:val="thaiDistribute"/>
-      </w:pPr>
-      <w:r>
         <w:rPr>
           <w:rFonts w:hint="cs"/>
-          <w:cs/>
-        </w:rPr>
-        <w:t>เพื่อ</w:t>
-      </w:r>
+        </w:rPr>
+      </w:pPr>
       <w:r>
         <w:rPr>
           <w:rFonts w:hint="cs"/>
           <w:cs/>
         </w:rPr>
-        <w:t>วิเคราะห์</w:t>
+        <w:t>เพื่อให้</w:t>
       </w:r>
       <w:r>
         <w:rPr>
           <w:rFonts w:hint="cs"/>
           <w:cs/>
         </w:rPr>
-        <w:t xml:space="preserve">คุณสมบัติของ </w:t>
-      </w:r>
-      <w:r>
-        <w:t xml:space="preserve">Encoder </w:t>
+        <w:t xml:space="preserve">วิเคราะห์ </w:t>
+      </w:r>
+      <w:r>
+        <w:t xml:space="preserve">Phase Relationship </w:t>
       </w:r>
       <w:r>
         <w:rPr>
           <w:rFonts w:hint="cs"/>
           <w:cs/>
         </w:rPr>
-        <w:t xml:space="preserve">ได้แก่ </w:t>
-      </w:r>
-      <w:r>
-        <w:t xml:space="preserve">Pulses </w:t>
-      </w:r>
-      <w:r>
-        <w:t>P</w:t>
-      </w:r>
-      <w:r>
-        <w:t xml:space="preserve">er </w:t>
-      </w:r>
-      <w:r>
-        <w:t>Re</w:t>
-      </w:r>
-      <w:r>
-        <w:t>volution</w:t>
-      </w:r>
-      <w:r>
-        <w:t xml:space="preserve"> (PPR) </w:t>
+        <w:t xml:space="preserve">ระหว่างสัญญาณ </w:t>
+      </w:r>
+      <w:r>
+        <w:t xml:space="preserve">A </w:t>
       </w:r>
       <w:r>
         <w:rPr>
@@ -490,7 +471,7 @@
         <w:t xml:space="preserve">และ </w:t>
       </w:r>
       <w:r>
-        <w:t>Angular Resolution</w:t>
+        <w:t>B</w:t>
       </w:r>
     </w:p>
     <w:p>
@@ -554,27 +535,27 @@
           <w:rFonts w:hint="cs"/>
           <w:cs/>
         </w:rPr>
-        <w:t>เพื่อให้</w:t>
+        <w:t>เพื่อ</w:t>
       </w:r>
       <w:r>
         <w:rPr>
           <w:rFonts w:hint="cs"/>
           <w:cs/>
         </w:rPr>
-        <w:t xml:space="preserve">วิเคราะห์ </w:t>
-      </w:r>
-      <w:r>
-        <w:t xml:space="preserve">Phase Relationship </w:t>
+        <w:t xml:space="preserve">วิเคราะห์คุณสมบัติของ </w:t>
+      </w:r>
+      <w:r>
+        <w:t xml:space="preserve">Encoder </w:t>
       </w:r>
       <w:r>
         <w:rPr>
           <w:rFonts w:hint="cs"/>
           <w:cs/>
         </w:rPr>
-        <w:t xml:space="preserve">ระหว่างสัญญาณ </w:t>
-      </w:r>
-      <w:r>
-        <w:t xml:space="preserve">A </w:t>
+        <w:t xml:space="preserve">ได้แก่ </w:t>
+      </w:r>
+      <w:r>
+        <w:t xml:space="preserve">Pulses Per Revolution (PPR) </w:t>
       </w:r>
       <w:r>
         <w:rPr>
@@ -584,7 +565,7 @@
         <w:t xml:space="preserve">และ </w:t>
       </w:r>
       <w:r>
-        <w:t>B</w:t>
+        <w:t>Angular Resolution</w:t>
       </w:r>
     </w:p>
     <w:p>
@@ -601,10 +582,34 @@
           <w:rFonts w:hint="cs"/>
           <w:cs/>
         </w:rPr>
-        <w:t xml:space="preserve">เพื่อให้ </w:t>
-      </w:r>
-      <w:r>
-        <w:t>xxx</w:t>
+        <w:t>เพื่อ</w:t>
+      </w:r>
+      <w:r>
+        <w:rPr>
+          <w:rFonts w:hint="cs"/>
+          <w:cs/>
+        </w:rPr>
+        <w:t>ออกแบบ</w:t>
+      </w:r>
+      <w:r>
+        <w:rPr>
+          <w:rFonts w:hint="cs"/>
+          <w:cs/>
+        </w:rPr>
+        <w:t xml:space="preserve"> </w:t>
+      </w:r>
+      <w:r>
+        <w:t xml:space="preserve">Wrap Around Function </w:t>
+      </w:r>
+      <w:r>
+        <w:rPr>
+          <w:rFonts w:hint="cs"/>
+          <w:cs/>
+        </w:rPr>
+        <w:t xml:space="preserve">สำหรับการอ่านค่า </w:t>
+      </w:r>
+      <w:r>
+        <w:t>Encoder</w:t>
       </w:r>
     </w:p>
     <w:p>
@@ -621,18 +626,113 @@
           <w:rFonts w:hint="cs"/>
           <w:cs/>
         </w:rPr>
-        <w:t xml:space="preserve">เพื่อให้ </w:t>
-      </w:r>
-      <w:r>
-        <w:t>xxx</w:t>
+        <w:t>เพื่อ</w:t>
+      </w:r>
+      <w:r>
+        <w:rPr>
+          <w:rFonts w:hint="cs"/>
+          <w:cs/>
+        </w:rPr>
+        <w:t xml:space="preserve">ออกแบบ </w:t>
+      </w:r>
+      <w:r>
+        <w:t>Homing Sequence</w:t>
+      </w:r>
+      <w:r>
+        <w:t xml:space="preserve"> Function</w:t>
+      </w:r>
+      <w:r>
+        <w:rPr>
+          <w:rFonts w:hint="cs"/>
+          <w:cs/>
+        </w:rPr>
+        <w:t xml:space="preserve"> </w:t>
+      </w:r>
+      <w:r>
+        <w:rPr>
+          <w:rFonts w:hint="cs"/>
+          <w:cs/>
+        </w:rPr>
+        <w:t>สำหรับการอ่านค่า</w:t>
+      </w:r>
+      <w:r>
+        <w:rPr>
+          <w:rFonts w:hint="cs"/>
+          <w:cs/>
+        </w:rPr>
+        <w:t xml:space="preserve"> </w:t>
+      </w:r>
+      <w:r>
+        <w:t>Encoder</w:t>
       </w:r>
     </w:p>
     <w:p>
       <w:pPr>
+        <w:numPr>
+          <w:ilvl w:val="0"/>
+          <w:numId w:val="1"/>
+        </w:numPr>
         <w:spacing w:after="0" w:line="240" w:lineRule="auto"/>
-        <w:rPr>
-          <w:cs/>
-        </w:rPr>
+        <w:jc w:val="thaiDistribute"/>
+      </w:pPr>
+      <w:r>
+        <w:rPr>
+          <w:rFonts w:hint="cs"/>
+          <w:cs/>
+        </w:rPr>
+        <w:t>เพื่อ</w:t>
+      </w:r>
+      <w:r>
+        <w:rPr>
+          <w:rFonts w:hint="cs"/>
+          <w:cs/>
+        </w:rPr>
+        <w:t xml:space="preserve">เปรียบเทียบลักษณะของสัญญาณของ </w:t>
+      </w:r>
+      <w:r>
+        <w:t xml:space="preserve">AMT-103 Encoder </w:t>
+      </w:r>
+      <w:r>
+        <w:rPr>
+          <w:rFonts w:hint="cs"/>
+          <w:cs/>
+        </w:rPr>
+        <w:t xml:space="preserve">และ </w:t>
+      </w:r>
+      <w:r>
+        <w:t>BOURNS PEC</w:t>
+      </w:r>
+      <w:r>
+        <w:rPr>
+          <w:cs/>
+        </w:rPr>
+        <w:t>11</w:t>
+      </w:r>
+      <w:r>
+        <w:t>R-</w:t>
+      </w:r>
+      <w:r>
+        <w:rPr>
+          <w:cs/>
+        </w:rPr>
+        <w:t>4220</w:t>
+      </w:r>
+      <w:r>
+        <w:t>F-N</w:t>
+      </w:r>
+      <w:r>
+        <w:rPr>
+          <w:cs/>
+        </w:rPr>
+        <w:t>0024</w:t>
+      </w:r>
+      <w:r>
+        <w:t xml:space="preserve"> </w:t>
+      </w:r>
+    </w:p>
+    <w:p>
+      <w:pPr>
+        <w:spacing w:after="0" w:line="240" w:lineRule="auto"/>
       </w:pPr>
       <w:r>
         <w:rPr>
@@ -687,107 +787,59 @@
         <w:spacing w:before="240" w:after="0" w:line="240" w:lineRule="auto"/>
         <w:jc w:val="thaiDistribute"/>
         <w:rPr>
-          <w:b/>
-          <w:bCs/>
-        </w:rPr>
-      </w:pPr>
-      <w:r>
-        <w:rPr>
-          <w:b/>
-          <w:bCs/>
-          <w:cs/>
-        </w:rPr>
-        <w:t xml:space="preserve">การทดลองที่ </w:t>
-      </w:r>
-      <w:r>
-        <w:rPr>
           <w:rFonts w:hint="cs"/>
           <w:b/>
           <w:bCs/>
-          <w:cs/>
-        </w:rPr>
-        <w:t xml:space="preserve">1 </w:t>
-      </w:r>
+        </w:rPr>
+      </w:pPr>
       <w:r>
         <w:rPr>
           <w:b/>
           <w:bCs/>
-        </w:rPr>
-        <w:t>XXX</w:t>
-      </w:r>
-      <w:r>
-        <w:rPr>
-          <w:b/>
-          <w:bCs/>
-        </w:rPr>
-        <w:t xml:space="preserve"> </w:t>
-      </w:r>
-      <w:r>
-        <w:rPr>
-          <w:b/>
-          <w:bCs/>
-          <w:sz w:val="36"/>
-          <w:szCs w:val="36"/>
-        </w:rPr>
-        <w:t>(</w:t>
-      </w:r>
-      <w:r>
-        <w:rPr>
-          <w:b/>
-          <w:bCs/>
-          <w:sz w:val="36"/>
-          <w:szCs w:val="36"/>
-        </w:rPr>
-        <w:t xml:space="preserve">TH </w:t>
-      </w:r>
-      <w:proofErr w:type="spellStart"/>
-      <w:r>
-        <w:rPr>
-          <w:b/>
-          <w:bCs/>
-          <w:sz w:val="36"/>
-          <w:szCs w:val="36"/>
-        </w:rPr>
-        <w:t>Sarabun</w:t>
-      </w:r>
-      <w:proofErr w:type="spellEnd"/>
-      <w:r>
-        <w:rPr>
-          <w:b/>
-          <w:bCs/>
-          <w:sz w:val="36"/>
-          <w:szCs w:val="36"/>
-        </w:rPr>
-        <w:t xml:space="preserve"> New</w:t>
-      </w:r>
-      <w:r>
-        <w:rPr>
-          <w:b/>
-          <w:bCs/>
-          <w:sz w:val="36"/>
-          <w:szCs w:val="36"/>
-        </w:rPr>
-        <w:t xml:space="preserve">, 16, </w:t>
+          <w:cs/>
+        </w:rPr>
+        <w:t xml:space="preserve">การทดลองที่ </w:t>
       </w:r>
       <w:r>
         <w:rPr>
           <w:rFonts w:hint="cs"/>
           <w:b/>
           <w:bCs/>
-          <w:sz w:val="36"/>
-          <w:szCs w:val="36"/>
-          <w:cs/>
-        </w:rPr>
-        <w:t>ตัวหนา</w:t>
-      </w:r>
-      <w:r>
-        <w:rPr>
+          <w:cs/>
+        </w:rPr>
+        <w:t xml:space="preserve">1 </w:t>
+      </w:r>
+      <w:r>
+        <w:rPr>
+          <w:rFonts w:hint="cs"/>
           <w:b/>
           <w:bCs/>
-          <w:sz w:val="36"/>
-          <w:szCs w:val="36"/>
-        </w:rPr>
-        <w:t>)</w:t>
+          <w:cs/>
+        </w:rPr>
+        <w:t xml:space="preserve">การวิเคราะห์สัญญาณ </w:t>
+      </w:r>
+      <w:r>
+        <w:rPr>
+          <w:b/>
+          <w:bCs/>
+        </w:rPr>
+        <w:t xml:space="preserve">A </w:t>
+      </w:r>
+      <w:r>
+        <w:rPr>
+          <w:rFonts w:hint="cs"/>
+          <w:b/>
+          <w:bCs/>
+          <w:cs/>
+        </w:rPr>
+        <w:t xml:space="preserve">และ </w:t>
+      </w:r>
+      <w:r>
+        <w:rPr>
+          <w:b/>
+          <w:bCs/>
+        </w:rPr>
+        <w:t>B</w:t>
       </w:r>
     </w:p>
     <w:p>
@@ -805,37 +857,6 @@
           <w:cs/>
         </w:rPr>
         <w:t>จุดประสงค์</w:t>
-      </w:r>
-      <w:r>
-        <w:rPr>
-          <w:b/>
-          <w:bCs/>
-        </w:rPr>
-        <w:t xml:space="preserve"> </w:t>
-      </w:r>
-      <w:r>
-        <w:t>(</w:t>
-      </w:r>
-      <w:r>
-        <w:rPr>
-          <w:rFonts w:hint="cs"/>
-          <w:cs/>
-        </w:rPr>
-        <w:t>การทดลองนี้สร้างขึ้น</w:t>
-      </w:r>
-      <w:r>
-        <w:rPr>
-          <w:rFonts w:hint="cs"/>
-          <w:cs/>
-        </w:rPr>
-        <w:t>เพื่ออะไร)</w:t>
-      </w:r>
-      <w:r>
-        <w:rPr>
-          <w:rFonts w:hint="cs"/>
-          <w:cs/>
-        </w:rPr>
-        <w:t xml:space="preserve"> </w:t>
       </w:r>
     </w:p>
     <w:p>
@@ -849,37 +870,34 @@
         <w:jc w:val="thaiDistribute"/>
       </w:pPr>
       <w:r>
-        <w:t>XXX</w:t>
-      </w:r>
-      <w:r>
         <w:rPr>
           <w:rFonts w:hint="cs"/>
           <w:cs/>
         </w:rPr>
-        <w:t xml:space="preserve"> </w:t>
-      </w:r>
-      <w:r>
-        <w:rPr>
-          <w:sz w:val="36"/>
-          <w:szCs w:val="36"/>
-        </w:rPr>
-        <w:t xml:space="preserve">(TH </w:t>
-      </w:r>
-      <w:proofErr w:type="spellStart"/>
-      <w:r>
-        <w:rPr>
-          <w:sz w:val="36"/>
-          <w:szCs w:val="36"/>
-        </w:rPr>
-        <w:t>Sarabun</w:t>
-      </w:r>
-      <w:proofErr w:type="spellEnd"/>
-      <w:r>
-        <w:rPr>
-          <w:sz w:val="36"/>
-          <w:szCs w:val="36"/>
-        </w:rPr>
-        <w:t xml:space="preserve"> New, 16)</w:t>
+        <w:t xml:space="preserve">เพื่อศึกษาลักษณะของสัญญาณ </w:t>
+      </w:r>
+      <w:r>
+        <w:t xml:space="preserve">A </w:t>
+      </w:r>
+      <w:r>
+        <w:rPr>
+          <w:rFonts w:hint="cs"/>
+          <w:cs/>
+        </w:rPr>
+        <w:t xml:space="preserve">และ </w:t>
+      </w:r>
+      <w:r>
+        <w:t xml:space="preserve">B </w:t>
+      </w:r>
+      <w:r>
+        <w:rPr>
+          <w:rFonts w:hint="cs"/>
+          <w:cs/>
+        </w:rPr>
+        <w:t xml:space="preserve">จากการหมุนของ </w:t>
+      </w:r>
+      <w:r>
+        <w:t>Encoder</w:t>
       </w:r>
     </w:p>
     <w:p>
@@ -893,7 +911,34 @@
         <w:jc w:val="thaiDistribute"/>
       </w:pPr>
       <w:r>
-        <w:t>XXX</w:t>
+        <w:rPr>
+          <w:rFonts w:hint="cs"/>
+          <w:cs/>
+        </w:rPr>
+        <w:t xml:space="preserve">เพื่อศึกษาพฤติกรรมของสัญญาณ </w:t>
+      </w:r>
+      <w:r>
+        <w:t xml:space="preserve">A </w:t>
+      </w:r>
+      <w:r>
+        <w:rPr>
+          <w:rFonts w:hint="cs"/>
+          <w:cs/>
+        </w:rPr>
+        <w:t xml:space="preserve">และ </w:t>
+      </w:r>
+      <w:r>
+        <w:t xml:space="preserve">B </w:t>
+      </w:r>
+      <w:r>
+        <w:rPr>
+          <w:rFonts w:hint="cs"/>
+          <w:cs/>
+        </w:rPr>
+        <w:t xml:space="preserve">จากทิศทางการหมุนของ </w:t>
+      </w:r>
+      <w:r>
+        <w:t>Encoder</w:t>
       </w:r>
     </w:p>
     <w:p>
@@ -907,7 +952,34 @@
         <w:jc w:val="thaiDistribute"/>
       </w:pPr>
       <w:r>
-        <w:t>XXX</w:t>
+        <w:rPr>
+          <w:rFonts w:hint="cs"/>
+          <w:cs/>
+        </w:rPr>
+        <w:t xml:space="preserve">เพื่อศึกษา </w:t>
+      </w:r>
+      <w:r>
+        <w:t xml:space="preserve">Phase Shift </w:t>
+      </w:r>
+      <w:r>
+        <w:rPr>
+          <w:rFonts w:hint="cs"/>
+          <w:cs/>
+        </w:rPr>
+        <w:t xml:space="preserve">ที่เกิดขึ้นระหว่างสัญญาณ </w:t>
+      </w:r>
+      <w:r>
+        <w:t xml:space="preserve">A </w:t>
+      </w:r>
+      <w:r>
+        <w:rPr>
+          <w:rFonts w:hint="cs"/>
+          <w:cs/>
+        </w:rPr>
+        <w:t xml:space="preserve">และ </w:t>
+      </w:r>
+      <w:r>
+        <w:t>B</w:t>
       </w:r>
     </w:p>
     <w:p>
@@ -953,11 +1025,38 @@
         <w:ind w:firstLine="720"/>
         <w:jc w:val="thaiDistribute"/>
         <w:rPr>
-          <w:cs/>
-        </w:rPr>
-      </w:pPr>
-      <w:r>
-        <w:t>XXX</w:t>
+          <w:rFonts w:hint="cs"/>
+        </w:rPr>
+      </w:pPr>
+      <w:r>
+        <w:rPr>
+          <w:rFonts w:hint="cs"/>
+          <w:cs/>
+        </w:rPr>
+        <w:t xml:space="preserve">จากลักษณะของโครงสร้างภายใน </w:t>
+      </w:r>
+      <w:r>
+        <w:t xml:space="preserve">Incremental Encoder </w:t>
+      </w:r>
+      <w:r>
+        <w:rPr>
+          <w:rFonts w:hint="cs"/>
+          <w:cs/>
+        </w:rPr>
+        <w:t>นั้</w:t>
+      </w:r>
+      <w:r>
+        <w:rPr>
+          <w:rFonts w:hint="cs"/>
+          <w:cs/>
+        </w:rPr>
+        <w:t xml:space="preserve">น โดยเฉพาะ </w:t>
+      </w:r>
+      <w:r>
+        <w:t>AMT-1</w:t>
+      </w:r>
+      <w:r>
+        <w:t>03</w:t>
       </w:r>
     </w:p>
     <w:p>
@@ -9021,6 +9120,10 @@
 </file>
 
 <file path=customXml/item1.xml><?xml version="1.0" encoding="utf-8"?>
+<b:Sources xmlns:b="http://schemas.openxmlformats.org/officeDocument/2006/bibliography" xmlns="http://schemas.openxmlformats.org/officeDocument/2006/bibliography" SelectedStyle="\APASixthEditionOfficeOnline.xsl" StyleName="APA" Version="6"/>
+</file>
+
+<file path=customXml/item2.xml><?xml version="1.0" encoding="utf-8"?>
 <ct:contentTypeSchema xmlns:ct="http://schemas.microsoft.com/office/2006/metadata/contentType" xmlns:ma="http://schemas.microsoft.com/office/2006/metadata/properties/metaAttributes" ct:_="" ma:_="" ma:contentTypeName="เอกสาร" ma:contentTypeID="0x010100EC5770EA766D9B40988FA670E28603CF" ma:contentTypeVersion="6" ma:contentTypeDescription="สร้างเอกสารใหม่" ma:contentTypeScope="" ma:versionID="a2f7d1d28ad95e979bb7613b0a62b43d">
   <xsd:schema xmlns:xsd="http://www.w3.org/2001/XMLSchema" xmlns:xs="http://www.w3.org/2001/XMLSchema" xmlns:p="http://schemas.microsoft.com/office/2006/metadata/properties" xmlns:ns3="659e3b7d-26b7-4d13-811e-1b8fc95c3522" targetNamespace="http://schemas.microsoft.com/office/2006/metadata/properties" ma:root="true" ma:fieldsID="f5a1f06c3c85eab79d41b016a8c71d93" ns3:_="">
     <xsd:import namespace="659e3b7d-26b7-4d13-811e-1b8fc95c3522"/>
@@ -9176,19 +9279,7 @@
 </ct:contentTypeSchema>
 </file>
 
-<file path=customXml/item2.xml><?xml version="1.0" encoding="utf-8"?>
-<b:Sources xmlns:b="http://schemas.openxmlformats.org/officeDocument/2006/bibliography" xmlns="http://schemas.openxmlformats.org/officeDocument/2006/bibliography" SelectedStyle="\APASixthEditionOfficeOnline.xsl" StyleName="APA" Version="6"/>
-</file>
-
 <file path=customXml/item3.xml><?xml version="1.0" encoding="utf-8"?>
-<p:properties xmlns:p="http://schemas.microsoft.com/office/2006/metadata/properties" xmlns:xsi="http://www.w3.org/2001/XMLSchema-instance" xmlns:pc="http://schemas.microsoft.com/office/infopath/2007/PartnerControls">
-  <documentManagement>
-    <_activity xmlns="659e3b7d-26b7-4d13-811e-1b8fc95c3522" xsi:nil="true"/>
-  </documentManagement>
-</p:properties>
-</file>
-
-<file path=customXml/item4.xml><?xml version="1.0" encoding="utf-8"?>
 <?mso-contentType ?>
 <FormTemplates xmlns="http://schemas.microsoft.com/sharepoint/v3/contenttype/forms">
   <Display>DocumentLibraryForm</Display>
@@ -9197,7 +9288,23 @@
 </FormTemplates>
 </file>
 
+<file path=customXml/item4.xml><?xml version="1.0" encoding="utf-8"?>
+<p:properties xmlns:p="http://schemas.microsoft.com/office/2006/metadata/properties" xmlns:xsi="http://www.w3.org/2001/XMLSchema-instance" xmlns:pc="http://schemas.microsoft.com/office/infopath/2007/PartnerControls">
+  <documentManagement>
+    <_activity xmlns="659e3b7d-26b7-4d13-811e-1b8fc95c3522" xsi:nil="true"/>
+  </documentManagement>
+</p:properties>
+</file>
+
 <file path=customXml/itemProps1.xml><?xml version="1.0" encoding="utf-8"?>
+<ds:datastoreItem xmlns:ds="http://schemas.openxmlformats.org/officeDocument/2006/customXml" ds:itemID="{95FB0139-A545-47E0-8C35-69BE14593E77}">
+  <ds:schemaRefs>
+    <ds:schemaRef ds:uri="http://schemas.openxmlformats.org/officeDocument/2006/bibliography"/>
+  </ds:schemaRefs>
+</ds:datastoreItem>
+</file>
+
+<file path=customXml/itemProps2.xml><?xml version="1.0" encoding="utf-8"?>
 <ds:datastoreItem xmlns:ds="http://schemas.openxmlformats.org/officeDocument/2006/customXml" ds:itemID="{859C7C01-9563-471E-B3EA-8AE60E6050F7}">
   <ds:schemaRefs>
     <ds:schemaRef ds:uri="http://schemas.microsoft.com/office/2006/metadata/contentType"/>
@@ -9215,15 +9322,15 @@
 </ds:datastoreItem>
 </file>
 
-<file path=customXml/itemProps2.xml><?xml version="1.0" encoding="utf-8"?>
-<ds:datastoreItem xmlns:ds="http://schemas.openxmlformats.org/officeDocument/2006/customXml" ds:itemID="{95FB0139-A545-47E0-8C35-69BE14593E77}">
+<file path=customXml/itemProps3.xml><?xml version="1.0" encoding="utf-8"?>
+<ds:datastoreItem xmlns:ds="http://schemas.openxmlformats.org/officeDocument/2006/customXml" ds:itemID="{FB6E50C7-B161-410D-82A0-50E58A6390FA}">
   <ds:schemaRefs>
-    <ds:schemaRef ds:uri="http://schemas.openxmlformats.org/officeDocument/2006/bibliography"/>
+    <ds:schemaRef ds:uri="http://schemas.microsoft.com/sharepoint/v3/contenttype/forms"/>
   </ds:schemaRefs>
 </ds:datastoreItem>
 </file>
 
-<file path=customXml/itemProps3.xml><?xml version="1.0" encoding="utf-8"?>
+<file path=customXml/itemProps4.xml><?xml version="1.0" encoding="utf-8"?>
 <ds:datastoreItem xmlns:ds="http://schemas.openxmlformats.org/officeDocument/2006/customXml" ds:itemID="{965345DC-B869-4FF8-A296-EBD1A94E682D}">
   <ds:schemaRefs>
     <ds:schemaRef ds:uri="http://schemas.microsoft.com/office/2006/metadata/properties"/>
@@ -9231,12 +9338,4 @@
     <ds:schemaRef ds:uri="659e3b7d-26b7-4d13-811e-1b8fc95c3522"/>
   </ds:schemaRefs>
 </ds:datastoreItem>
-</file>
-
-<file path=customXml/itemProps4.xml><?xml version="1.0" encoding="utf-8"?>
-<ds:datastoreItem xmlns:ds="http://schemas.openxmlformats.org/officeDocument/2006/customXml" ds:itemID="{FB6E50C7-B161-410D-82A0-50E58A6390FA}">
-  <ds:schemaRefs>
-    <ds:schemaRef ds:uri="http://schemas.microsoft.com/sharepoint/v3/contenttype/forms"/>
-  </ds:schemaRefs>
-</ds:datastoreItem>
 </file>
</xml_diff>